<commit_message>
feat(studies): revise continuous BP, paired CEC and renal WMH interaction
</commit_message>
<xml_diff>
--- a/docs/CNSRIII_五项独立研究统计分析方案_20260917.docx
+++ b/docs/CNSRIII_五项独立研究统计分析方案_20260917.docx
@@ -14,7 +14,7 @@
     </w:p>
     <w:p>
       <w:r>
-        <w:t>版本日期 2026年9月17日</w:t>
+        <w:t>版本日期 2026年9月17日 第二版</w:t>
       </w:r>
     </w:p>
     <w:p>
@@ -365,7 +365,7 @@
                 <w:b w:val="0"/>
                 <w:sz w:val="20"/>
               </w:rPr>
-              <w:t>恢复期功能和WMH相近时持续白蛋白尿是否提示远期依赖</w:t>
+              <w:t>持续白蛋白尿与五年依赖的关联是否随WMH增强</w:t>
             </w:r>
           </w:p>
         </w:tc>
@@ -382,7 +382,7 @@
                 <w:b w:val="0"/>
                 <w:sz w:val="20"/>
               </w:rPr>
-              <w:t>多分类模型依赖方程中持续升高与两次均低的对比</w:t>
+              <w:t>多分类模型依赖方程中持续升高类别与WMH交互的1自由度检验</w:t>
             </w:r>
           </w:p>
         </w:tc>
@@ -823,7 +823,12 @@
     </w:p>
     <w:p>
       <w:r>
-        <w:t>主要临床对比是WMH第25、50、75百分位处，SBP 130相对140 mmHg的HR及95%区间。120和150相对140作为补充展示。对比使用完整协方差。各WMH展示点周围的分位区间至少有20名受试者且涵盖两个比较血压值时才显示；否则报告超出观测支持，不换参考点寻找显著结果。这是外推检查，不是临床阈值。</w:t>
+        <w:t>SBP始终作为连续变量建模。主图横轴为连续SBP，纵轴为相对140 mmHg的HR，分别在WMH第25、50、75百分位绘制曲线和逐点95%区间，并附血压频数分布。三个WMH位置只是展示点，不把连续WMH切成临床分组；140是计算参照，不是推荐目标。</w:t>
+      </w:r>
+    </w:p>
+    <w:p>
+      <w:r>
+        <w:t>曲线在各WMH展示点周围的分位区间（12.5–37.5、37.5–62.5、62.5–87.5百分位）核验SBP支持范围。对应区间至少20人、目标SBP与140均处于该区间SBP第2.5–97.5百分位之间才展示。该限制只用于绘图，不删分析病例。130相对140的HR仍列补充表，120和150同样预设；固定点对比沿用观测最小至最大范围检查。全部对比使用完整协方差，不把非线性模型概括为全血压范围恒定的每10 mmHg HR。</w:t>
       </w:r>
     </w:p>
     <w:p>
@@ -919,7 +924,12 @@
     </w:p>
     <w:p>
       <w:r>
-        <w:t>调整集合为研究04的主要集合，另固定加入HDL-C。CEC的解释为HDL-C相近条件下的结构差异，不因HDL-C的P值不显著而删除它。异常CEC值不依据样本分位数自动截尾；非法数值和单位冲突由审计报告。</w:t>
+        <w:t>主要模型M1采用研究04的调整集合，另固定加入HDL-C。它回答HDL胆固醇浓度相近时CEC是否仍有结构关联。该选择有原始研究依据：Dallas Heart Study表2脚注和图2明确对CEC模型加入HDL-C。[6] 这是一项条件关联定义，不由HDL-C的单因素P值决定，也不等同于已经确认HDL-C是因果混杂因素。</w:t>
+      </w:r>
+    </w:p>
+    <w:p>
+      <w:r>
+        <w:t>新增M0模型，仅从M1中去掉HDL-C项，其余协变量不变。M0与M1必须使用完全相同的患者、结局、CEC尺度和M1产生的同一套完成数据；不另行插补，不因HDL-C缺失扩大M0人群。并排报告CEC系数和95%区间，不把显著性不同当成两模型效应不同，不把系数变化解释为中介比例。M1仍是唯一主要检验，M0属于敏感性分析。调整HDL-C不等于测得每个HDL颗粒的固有功能。</w:t>
       </w:r>
     </w:p>
     <w:p>
@@ -934,7 +944,7 @@
     </w:p>
     <w:p>
       <w:r>
-        <w:t>主要交付为CEC每1 SD对应的灰质体积差异、95%区间、主要P值，以及分开标记的次要结果表。若置信区间接近零且较窄，则该人群下的结构差异可能有限；若较宽，则首先说明精度不足。</w:t>
+        <w:t>主要图表并列M0与M1的CEC每1 SD灰质体积差异和95%区间，明确标记M1为主要。异常CEC值不按样本分位数自动截尾；非法数值和单位冲突由审计报告。区间接近零且较窄提示差异可能有限，区间较宽首先说明精度不足。</w:t>
       </w:r>
     </w:p>
     <w:p>
@@ -952,7 +962,12 @@
     </w:p>
     <w:p>
       <w:r>
-        <w:t>CNSR-III已发表基线和3个月白蛋白尿与一年预后的分析，持续白蛋白尿与不良结局相关。[7] 本研究的新增问题是在基线WMH和3个月功能相近时，两次白蛋白尿信息是否仍与五年依赖相关。因此研究重点是额外的条件预后信息，而不是再次证明白蛋白尿与一年结局有关。</w:t>
+        <w:t>CNSR-III已发表基线和3个月白蛋白尿与一年预后的分析，持续白蛋白尿与不良结局相关。[7] 本研究将持续白蛋白尿视为可能的全身微血管异常标志，WMH视为既有脑损伤表型，检验两者与远期依赖的关联是否相互修饰。卒中患者中UACR与白质病变严重程度的关联为该假设提供背景依据，但并未证明两者存在交互。[13]</w:t>
+      </w:r>
+    </w:p>
+    <w:p>
+      <w:r>
+        <w:t>主要假设是：在恢复期功能、血压、肾脏滤过功能及其他预设背景因素相近时，持续白蛋白尿相对两次均低与五年依赖的关联，随基线WMH负担增加而增强。交互零假设为对应系数等于零，采用双侧检验，效应方向单独解释。</w:t>
       </w:r>
     </w:p>
     <w:p>
@@ -1272,22 +1287,45 @@
     </w:p>
     <w:p>
       <w:r>
-        <w:t>主要假设为：在WMH、恢复期mRS、SBP和肾滤过功能等背景相近时，持续升高相对两次均低与较高的五年依赖/独立概率比相关。主要模型为三状态多分类logistic，唯一主要检验为依赖方程中持续升高类别的系数。</w:t>
+        <w:br w:type="page"/>
+      </w:r>
+    </w:p>
+    <w:p>
+      <w:pPr>
+        <w:pStyle w:val="Heading1"/>
+      </w:pPr>
+      <w:r>
+        <w:t>06 交互模型和临床解释</w:t>
       </w:r>
     </w:p>
     <w:p>
       <w:r>
-        <w:t>调整C、BMI、教育、3个月胱抑素C、3个月SBP、出院ACEI/ARB、3个月mRS、ICV及连续WMH。没有Hcy要求；不使用字典中实际含义为表皮生长因子受体的eGFR字段。降压子项明确未用药者可依据父项“未使用”归零；相互矛盾的记录标记而非任意覆盖。</w:t>
+        <w:t>保留独立、依赖、死亡三状态多分类logistic。设W为标准化log(1＋WMH)，A1、A2、A3分别是基线升高后降低、恢复期新升高、持续升高指示变量，两次均低为参照。依赖和死亡两个方程均包括W、三个A主效应以及A1×W、A2×W、A3×W，不将其他两类患者合并到参照组。</w:t>
       </w:r>
     </w:p>
     <w:p>
       <w:r>
-        <w:t>次要分析为：基线UACR与基线WMH，使用基线C、BMI、教育、CYSC、入院SBP和ICV；连续log(1＋M03_UACR)与五年功能状态并调整基线log(1＋UACR)；同样本临床＋WMH与增加三项白蛋白尿类别的模型，用联合Wald检验评估依赖方程增量关联；加入NIHSS、TOAST和急性梗死体积并与同一子样本原模型比较。</w:t>
+        <w:t>唯一主要检验为依赖方程A3×W系数等于零，1自由度。系数取指数表示WMH增加1 SD时，“持续升高相对两次均低”的依赖/独立相对概率比如何变化；大于1支持预期增强方向，小于1为相反方向。它不是复发HR。A3主效应仅代表W中心位置的对比，不能称为整个WMH范围的统一效应。</w:t>
       </w:r>
     </w:p>
     <w:p>
       <w:r>
-        <w:t>主要版本不增加UACR×WMH交互。基线结构模型不调整未来3个月指标。报告完整病例和结局可观测概率加权敏感性分析。两次UACR不插补，因此缺少任一次测量者不构造“持续”分组。</w:t>
+        <w:t>调整C、BMI、教育、3个月胱抑素C、3个月SBP、出院ACEI/ARB、3个月mRS和ICV。WMH及白蛋白尿均为核心研究指标。无Hcy要求，不使用含义为表皮生长因子受体的eGFR字段。四种白蛋白尿状态不足以估计预设模型时明确报告，不自动改参照或合并类别。</w:t>
+      </w:r>
+    </w:p>
+    <w:p>
+      <w:r>
+        <w:t>主图沿连续WMH展示持续升高与两次均低的五年依赖概率，以及两者的绝对概率差。标准化使用同一分析人群的协变量分布。展示范围取两组各自WMH第2.5–97.5百分位的交集，每组至少20人；不将范围限制用于队列筛选。区间通过完整跨方程协方差和两场景共享系数的协方差计算，再按Rubin合并，无需bootstrap。</w:t>
+      </w:r>
+    </w:p>
+    <w:p>
+      <w:r>
+        <w:t>三个类别交互的3自由度整体检验列为次要。另以连续log(1＋M03_UACR)×W检验方向，并调整基线log(1＋UACR)。保留不含交互的原条件关联模型为次要，以及临床＋WMH模型与增加白蛋白尿类别的增量联合检验。基线UACR与WMH结构模型仅用基线调整因素；不加入未来的3个月指标。</w:t>
+      </w:r>
+    </w:p>
+    <w:p>
+      <w:r>
+        <w:t>完整病例、NIHSS/TOAST/急性梗死的同子样本扩展和结局可观测概率加权均保留交互。概率差属于补充描述，不将其与相对概率尺度的交互检验混为一谈；二者可有不同结论。两种损伤并存者结局更差本身不能证明交互或生物协同。[14]</w:t>
       </w:r>
     </w:p>
     <w:p>
@@ -1742,7 +1780,7 @@
     </w:p>
     <w:p>
       <w:r>
-        <w:t>分类参考值按字典顺序在实际观察类别中固定。主队列某合法类别完全未出现时，该类别没有可估计系数；这不是删除该变量。后续子队列或重编码造成固定矩阵奇异时明确失败，不临时合并类别。</w:t>
+        <w:t>分类参考值按字典顺序在实际观察类别中固定。脑肾模型的白蛋白尿参照固定为两次均低，四种预设状态必须可用以估计完整交互模型。其他协变量某合法类别完全未出现时没有相应系数，这不是删除变量。子队列使固定矩阵奇异时明确失败，不临时合并类别。</w:t>
       </w:r>
     </w:p>
     <w:p>
@@ -2331,12 +2369,22 @@
     </w:p>
     <w:p>
       <w:r>
+        <w:t>[13] Urinary albumin-to-creatinine ratio is associated with white matter lesions severity in first-ever stroke patients. 2017. PMID 28131201. https://pubmed.ncbi.nlm.nih.gov/28131201/</w:t>
+      </w:r>
+    </w:p>
+    <w:p>
+      <w:r>
+        <w:t>[14] VanderWeele TJ, Knol MJ. A Tutorial on Interaction. Epidemiologic Methods, 2014;3(1):33–72. DOI 10.1515/em-2013-0005. https://doi.org/10.1515/em-2013-0005</w:t>
+      </w:r>
+    </w:p>
+    <w:p>
+      <w:r>
         <w:t>文献用途分别为临床背景、具体暴露选择、测量原则、协变量选择和合并推断。不同人群的影像关联不能替代本队列验证；随机血压目标试验不能直接赋予观察性实测血压因果含义。</w:t>
       </w:r>
     </w:p>
     <w:p>
       <w:r>
-        <w:t>本次版本固定五项问题及主要检验，代码合同标识为imaging_five_studies_20260917_v1。细化执行规则包括：血压同值固定取左侧；功能验证补充基线卒中严重程度；观测支持限制仅用于图表；急性梗死为结局时移除相同调整项；权重估计采用堆叠sandwich；无估计项保留预设多重比较家庭大小。</w:t>
+        <w:t>第二版合同为imaging_five_studies_20260917_v2。修订包括连续血压主图、CEC同样本同插补的HDL-C调整比较、脑肾持续白蛋白尿×WMH主要检验及交互曲线。五项主要检验数量不变；脑肾新版P值替换旧版主效应P值进入Holm。旧版结果保留，标为PREVIOUS_VERSION，不混入新版汇总。</w:t>
       </w:r>
     </w:p>
     <w:p>

</xml_diff>